<commit_message>
Artefacts for HARVEST PROTOCOL: build log session 9, design intent, README, packager rename
Co-Authored-By: Claude Fable 5 <noreply@anthropic.com>
Claude-Session: https://claude.ai/code/session_015HVMZAnz1XzLXYvjBCtuDA
</commit_message>
<xml_diff>
--- a/submission/design-intent.docx
+++ b/submission/design-intent.docx
@@ -8,7 +8,7 @@
         <w:spacing w:after="120"/>
       </w:pPr>
       <w:r>
-        <w:t xml:space="preserve">Design Intent — NEURAL SPIRE</w:t>
+        <w:t xml:space="preserve">Design Intent — HARVEST PROTOCOL</w:t>
       </w:r>
     </w:p>
     <w:p>
@@ -33,7 +33,7 @@
         <w:spacing w:after="120"/>
       </w:pPr>
       <w:r>
-        <w:t xml:space="preserve">Mobile players who like short, thinky defense sessions — Kingdom Rush or Bloons fans who play one-thumbed, phone upright, in five-minute windows. They want decisions over reflexes, and runs won or lost on economic strength.</w:t>
+        <w:t xml:space="preserve">Mobile players who love the macro half of an RTS — the StarCraft instinct of "one more worker, then army" — but want it one-thumbed, phone upright, in short sessions. They want economies to run, trade-offs to weigh, and defenses that fail for readable reasons.</w:t>
       </w:r>
     </w:p>
     <w:p>
@@ -50,31 +50,23 @@
         <w:spacing w:after="120"/>
       </w:pPr>
       <w:r>
-        <w:t xml:space="preserve">NEURAL SPIRE turns the tower defense map into a literal tower. Rogue processes spawn at the base of a vertical spire and climb a winding ramp toward the summit core; the player mounts defense programs on sockets that spiral up the outside, dragging with one thumb to orbit and climb the view. Portrait orientation is not an accommodation — the game is shaped like the screen.</w:t>
-      </w:r>
-    </w:p>
-    <w:p>
-      <w:pPr>
-        <w:spacing w:after="120"/>
-      </w:pPr>
-      <w:r>
-        <w:t xml:space="preserve">The campaign is nine authored nodes, each a distinct spire built from arcs, switchbacks, steep risers and plaza rings — fixed per node, so layouts are learnable. Each node adds one element and turns one difficulty knob: new threats get isolated showcase waves before appearing under pressure; topology itself is difficulty (a short spire buys less damage time, sparse sockets make placement the puzzle); twist nodes bend the rules — core power cut, fliers on an updraft, an inverted economy. Waves are composed on encounter budgets with authored pacing: light opener, surge beats, a breather before every finale, scripted bosses.</w:t>
-      </w:r>
-    </w:p>
-    <w:p>
-      <w:pPr>
-        <w:spacing w:after="120"/>
-      </w:pPr>
-      <w:r>
-        <w:t xml:space="preserve">Being 3D does mechanical work. Gravity is a weapon: Repulsor turrets hurl climbers off the ramp, and fall height pays a salvage bonus — mount them high for bigger payouts that arrive later. Turrets cannot shoot through the central column, so coverage angles matter. Fliers skip the ramp entirely and must be met at altitude.</w:t>
-      </w:r>
-    </w:p>
-    <w:p>
-      <w:pPr>
-        <w:spacing w:after="120"/>
-      </w:pPr>
-      <w:r>
-        <w:t xml:space="preserve">The economy is the second front. Kills pay salvage; unspent salvage earns interest each wave, so hoarding compounds — until the wave you under-built for breaks through. Power is a hard grid: turrets drain it, generators add more while occupying defense sockets. Each build phase deals three pick-one directives — market-style trades like Bull Market, War Bonds, or Insurance — and the SPIRE OS tech tree sells six permanent upgrades that compete with turret spending. Playtests show the loop has teeth: defenses that win when actively managed lose when left alone.</w:t>
+        <w:t xml:space="preserve">HARVEST PROTOCOL is a tower defense where the economy is the battlefield. Income is mined, not earned per kill: harvester drones visibly shuttle crystal loads from fields to drop-offs, so your worker count is your income rate — and raiders ignore your core entirely to hunt the miners instead. Every macro question ports straight from RTS: another miner or another cannon? Expand a depot toward the rich far field, or milk the safe one? Fields hold finite reserves and visibly shrink as they drain, forcing expansion onto worse ground mid-run.</w:t>
+      </w:r>
+    </w:p>
+    <w:p>
+      <w:pPr>
+        <w:spacing w:after="120"/>
+      </w:pPr>
+      <w:r>
+        <w:t xml:space="preserve">Defense is physical. Walls block the ground routes and get broken down; brutes siege your structures; buildings hold integrity and want repair minerals; a hard power grid (generators feed it) caps how many turrets can run. Waves pour from map-edge gates across free-form top-down terrain, so the player shapes lanes with walls instead of inheriting a path.</w:t>
+      </w:r>
+    </w:p>
+    <w:p>
+      <w:pPr>
+        <w:spacing w:after="120"/>
+      </w:pPr>
+      <w:r>
+        <w:t xml:space="preserve">Around the mining core sits a decision layer that recurs every wave: interest compounds on unspent minerals; each build phase deals three pick-one directives (Mining Surge, Escort Drones, War Bonds, Bounty Market — every one a trade, never a buff); and the CORE OS tech tree sells six permanent upgrades that compete with the next turret for the same minerals.</w:t>
       </w:r>
     </w:p>
     <w:p>
@@ -91,7 +83,7 @@
         <w:spacing w:after="120"/>
       </w:pPr>
       <w:r>
-        <w:t xml:space="preserve">The full nine-node campaign with sequential unlocks and three-star ratings, five threat types, five buildable systems with upgrades, selling and overclocking, nine directives, the tech tree, wave previews and a wave-end income report. Win, lose and retry states with run statistics, endless overtime, first-run onboarding, procedural audio, persistent progress. Everything renders in Three.js with procedural geometry — no external assets, no network requests.</w:t>
+        <w:t xml:space="preserve">Nine authored operations with fixed layouts, sequential unlocks and three-star ratings. Each op adds one element via an isolated showcase wave (raiders, siege brutes) or bends one rule (core power cut, raider speed surge, an inverted market where only interest pays well, the motherlode parked beside the enemy gates). Encounter-budget waves with authored pacing — openers, surge beats, a breather before every finale, scripted ARCHON bosses that smash through walls. Five threat types, seven buildables, miners with caps and depots, repair/upgrade/overclock/sell, wave previews, a wave-end income report, endless overtime, onboarding, procedural audio, persistent progress. No external assets, no network requests.</w:t>
       </w:r>
     </w:p>
     <w:p>
@@ -108,7 +100,7 @@
         <w:spacing w:after="120"/>
       </w:pPr>
       <w:r>
-        <w:t xml:space="preserve">The vision is a spire that fights back. Next: branching ramps with buyable barricades to funnel threats; wind and hazard floors that interact with knock-off physics; wall-climbing and repulsion-shielding threats; a heat resource that turns overclocking into a risk economy. Later, daily spires with shared seeds, per-seed leaderboards, and ghost comparisons of friends’ defenses. Visuals stay procedural: the constraint is the aesthetic.</w:t>
+        <w:t xml:space="preserve">Deeper logistics: convoy routes that can be ambushed, refineries that multiply raw loads, contested neutral expansions. Smarter pressure: raider packs that probe for the weakest stretch of wall, sappers that tunnel. A second resource (gas vents) for high-tier tech, day/night wave rhythms, and daily operations on shared seeds with per-seed leaderboards. Visuals stay procedural: the constraint is the aesthetic.</w:t>
       </w:r>
     </w:p>
     <w:sectPr>

</xml_diff>